<commit_message>
[UIAO-DOCS] LOG: append Turn 4-5 — Step 0a adapter registries landed
</commit_message>
<xml_diff>
--- a/docs/session-logs/2026-04-14-customer-docs-platform.docx
+++ b/docs/session-logs/2026-04-14-customer-docs-platform.docx
@@ -2126,14 +2126,90 @@
       </w:r>
     </w:p>
     <w:p>
+      <w:r>
+        <w:pict>
+          <v:rect style="width:0;height:1.5pt" o:hralign="center" o:hrstd="t" o:hr="t"/>
+        </w:pict>
+      </w:r>
+    </w:p>
+    <w:p>
       <w:pPr>
         <w:pStyle w:val="Heading2"/>
       </w:pPr>
-      <w:bookmarkStart w:id="27" w:name="next-up"/>
-      <w:r>
-        <w:t xml:space="preserve">Next Up</w:t>
+      <w:bookmarkStart w:id="27" w:name="turn-4-2026-04-14t1512z-michael"/>
+      <w:r>
+        <w:t xml:space="preserve">Turn 4 — 2026-04-14T15:12Z — Michael</w:t>
       </w:r>
       <w:bookmarkEnd w:id="27"/>
+    </w:p>
+    <w:p>
+      <w:pPr>
+        <w:pStyle w:val="BlockText"/>
+      </w:pPr>
+      <w:r>
+        <w:t xml:space="preserve">[Confirmed commit</w:t>
+      </w:r>
+      <w:r>
+        <w:t xml:space="preserve"> </w:t>
+      </w:r>
+      <w:r>
+        <w:rPr>
+          <w:rStyle w:val="VerbatimChar"/>
+        </w:rPr>
+        <w:t xml:space="preserve">2a67d07</w:t>
+      </w:r>
+      <w:r>
+        <w:t xml:space="preserve"> </w:t>
+      </w:r>
+      <w:r>
+        <w:t xml:space="preserve">on uiao-docs pushed successfully. GitHub flagged</w:t>
+      </w:r>
+      <w:r>
+        <w:t xml:space="preserve"> </w:t>
+      </w:r>
+      <w:r>
+        <w:t xml:space="preserve">“</w:t>
+      </w:r>
+      <w:r>
+        <w:t xml:space="preserve">Build and Deploy Documentation</w:t>
+      </w:r>
+      <w:r>
+        <w:t xml:space="preserve">”</w:t>
+      </w:r>
+      <w:r>
+        <w:t xml:space="preserve"> </w:t>
+      </w:r>
+      <w:r>
+        <w:t xml:space="preserve">required status check as expected-but-bypassed — owner has admin override rights.]</w:t>
+      </w:r>
+    </w:p>
+    <w:p>
+      <w:pPr>
+        <w:pStyle w:val="FirstParagraph"/>
+      </w:pPr>
+      <w:r>
+        <w:rPr>
+          <w:b/>
+        </w:rPr>
+        <w:t xml:space="preserve">Interpretation:</w:t>
+      </w:r>
+      <w:r>
+        <w:t xml:space="preserve"> </w:t>
+      </w:r>
+      <w:r>
+        <w:t xml:space="preserve">Session-log scaffold is live on GitHub. Clear to proceed with Step 0a (adapter registries).</w:t>
+      </w:r>
+    </w:p>
+    <w:p>
+      <w:pPr>
+        <w:pStyle w:val="BodyText"/>
+      </w:pPr>
+      <w:r>
+        <w:rPr>
+          <w:b/>
+        </w:rPr>
+        <w:t xml:space="preserve">Actions (Claude):</w:t>
+      </w:r>
     </w:p>
     <w:p>
       <w:pPr>
@@ -2144,49 +2220,7 @@
         <w:pStyle w:val="Compact"/>
       </w:pPr>
       <w:r>
-        <w:t xml:space="preserve">Kick off</w:t>
-      </w:r>
-      <w:r>
-        <w:t xml:space="preserve"> </w:t>
-      </w:r>
-      <w:r>
-        <w:rPr>
-          <w:b/>
-        </w:rPr>
-        <w:t xml:space="preserve">Step 0a</w:t>
-      </w:r>
-      <w:r>
-        <w:t xml:space="preserve">: seed</w:t>
-      </w:r>
-      <w:r>
-        <w:t xml:space="preserve"> </w:t>
-      </w:r>
-      <w:r>
-        <w:rPr>
-          <w:rStyle w:val="VerbatimChar"/>
-        </w:rPr>
-        <w:t xml:space="preserve">uiao-core/canon/adapter-registry.yaml</w:t>
-      </w:r>
-      <w:r>
-        <w:t xml:space="preserve"> </w:t>
-      </w:r>
-      <w:r>
-        <w:t xml:space="preserve">and</w:t>
-      </w:r>
-      <w:r>
-        <w:t xml:space="preserve"> </w:t>
-      </w:r>
-      <w:r>
-        <w:rPr>
-          <w:rStyle w:val="VerbatimChar"/>
-        </w:rPr>
-        <w:t xml:space="preserve">canon/modernization-registry.yaml</w:t>
-      </w:r>
-      <w:r>
-        <w:t xml:space="preserve"> </w:t>
-      </w:r>
-      <w:r>
-        <w:t xml:space="preserve">with the five modernization adapters and the four conformance adapter slots (one active, three reserved).</w:t>
+        <w:t xml:space="preserve">Updated todo list with Step 0a subtasks.</w:t>
       </w:r>
     </w:p>
     <w:p>
@@ -2198,37 +2232,22 @@
         <w:pStyle w:val="Compact"/>
       </w:pPr>
       <w:r>
-        <w:t xml:space="preserve">Extend</w:t>
-      </w:r>
-      <w:r>
-        <w:t xml:space="preserve"> </w:t>
-      </w:r>
-      <w:r>
-        <w:rPr>
-          <w:rStyle w:val="VerbatimChar"/>
-        </w:rPr>
-        <w:t xml:space="preserve">uiao-core/schemas/adapter-registry.schema.json</w:t>
-      </w:r>
-      <w:r>
-        <w:t xml:space="preserve"> </w:t>
-      </w:r>
-      <w:r>
-        <w:t xml:space="preserve">to accept the new</w:t>
-      </w:r>
-      <w:r>
-        <w:t xml:space="preserve"> </w:t>
-      </w:r>
-      <w:r>
-        <w:rPr>
-          <w:rStyle w:val="VerbatimChar"/>
-        </w:rPr>
-        <w:t xml:space="preserve">class</w:t>
-      </w:r>
-      <w:r>
-        <w:t xml:space="preserve"> </w:t>
-      </w:r>
-      <w:r>
-        <w:t xml:space="preserve">enum.</w:t>
+        <w:t xml:space="preserve">Read</w:t>
+      </w:r>
+      <w:r>
+        <w:t xml:space="preserve"> </w:t>
+      </w:r>
+      <w:r>
+        <w:rPr>
+          <w:rStyle w:val="VerbatimChar"/>
+        </w:rPr>
+        <w:t xml:space="preserve">uiao-core/canon/UIAO_003_Adapter_Segmentation_Overview_v1.0.md</w:t>
+      </w:r>
+      <w:r>
+        <w:t xml:space="preserve"> </w:t>
+      </w:r>
+      <w:r>
+        <w:t xml:space="preserve">(268 lines) to confirm the canonical doctrinal adapter taxonomy.</w:t>
       </w:r>
     </w:p>
     <w:p>
@@ -2240,7 +2259,2252 @@
         <w:pStyle w:val="Compact"/>
       </w:pPr>
       <w:r>
-        <w:t xml:space="preserve">Append a new turn to this log when that work lands.</w:t>
+        <w:rPr>
+          <w:b/>
+        </w:rPr>
+        <w:t xml:space="preserve">Discovered taxonomy collision.</w:t>
+      </w:r>
+      <w:r>
+        <w:t xml:space="preserve"> </w:t>
+      </w:r>
+      <w:r>
+        <w:t xml:space="preserve">UIAO_003 names four doctrinal adapter classes (Identity, Telemetry, Policy, Enforcement — three of four still</w:t>
+      </w:r>
+      <w:r>
+        <w:t xml:space="preserve"> </w:t>
+      </w:r>
+      <w:r>
+        <w:rPr>
+          <w:rStyle w:val="VerbatimChar"/>
+        </w:rPr>
+        <w:t xml:space="preserve">NEW (Proposed)</w:t>
+      </w:r>
+      <w:r>
+        <w:t xml:space="preserve">), while the prior session committed</w:t>
+      </w:r>
+      <w:r>
+        <w:t xml:space="preserve"> </w:t>
+      </w:r>
+      <w:r>
+        <w:rPr>
+          <w:rStyle w:val="VerbatimChar"/>
+        </w:rPr>
+        <w:t xml:space="preserve">class: modernization | conformance</w:t>
+      </w:r>
+      <w:r>
+        <w:t xml:space="preserve"> </w:t>
+      </w:r>
+      <w:r>
+        <w:t xml:space="preserve">into</w:t>
+      </w:r>
+      <w:r>
+        <w:t xml:space="preserve"> </w:t>
+      </w:r>
+      <w:r>
+        <w:rPr>
+          <w:rStyle w:val="VerbatimChar"/>
+        </w:rPr>
+        <w:t xml:space="preserve">ARCHITECTURE.md</w:t>
+      </w:r>
+      <w:r>
+        <w:t xml:space="preserve"> </w:t>
+      </w:r>
+      <w:r>
+        <w:t xml:space="preserve">§3.2 as the adapter-registry field. These are orthogonal axes, not competing taxonomies. Paused to surface to owner via</w:t>
+      </w:r>
+      <w:r>
+        <w:t xml:space="preserve"> </w:t>
+      </w:r>
+      <w:r>
+        <w:rPr>
+          <w:rStyle w:val="VerbatimChar"/>
+        </w:rPr>
+        <w:t xml:space="preserve">AskUserQuestion</w:t>
+      </w:r>
+      <w:r>
+        <w:t xml:space="preserve">.</w:t>
+      </w:r>
+    </w:p>
+    <w:p>
+      <w:pPr>
+        <w:pStyle w:val="Heading2"/>
+      </w:pPr>
+      <w:bookmarkStart w:id="28" w:name="X8d3411307314efbbed596429543287678db6e73"/>
+      <w:r>
+        <w:t xml:space="preserve">Turn 5 — 2026-04-14T15:15Z — Michael (via AskUserQuestion)</w:t>
+      </w:r>
+      <w:bookmarkEnd w:id="28"/>
+    </w:p>
+    <w:p>
+      <w:pPr>
+        <w:pStyle w:val="FirstParagraph"/>
+      </w:pPr>
+      <w:r>
+        <w:rPr>
+          <w:b/>
+        </w:rPr>
+        <w:t xml:space="preserve">Answer:</w:t>
+      </w:r>
+      <w:r>
+        <w:t xml:space="preserve"> </w:t>
+      </w:r>
+      <w:r>
+        <w:t xml:space="preserve">Dual-axis (Recommended) — registry carries both</w:t>
+      </w:r>
+      <w:r>
+        <w:t xml:space="preserve"> </w:t>
+      </w:r>
+      <w:r>
+        <w:rPr>
+          <w:rStyle w:val="VerbatimChar"/>
+        </w:rPr>
+        <w:t xml:space="preserve">class</w:t>
+      </w:r>
+      <w:r>
+        <w:t xml:space="preserve"> </w:t>
+      </w:r>
+      <w:r>
+        <w:t xml:space="preserve">(operational) and</w:t>
+      </w:r>
+      <w:r>
+        <w:t xml:space="preserve"> </w:t>
+      </w:r>
+      <w:r>
+        <w:rPr>
+          <w:rStyle w:val="VerbatimChar"/>
+        </w:rPr>
+        <w:t xml:space="preserve">mission-class</w:t>
+      </w:r>
+      <w:r>
+        <w:t xml:space="preserve"> </w:t>
+      </w:r>
+      <w:r>
+        <w:t xml:space="preserve">(doctrinal) as orthogonal fields.</w:t>
+      </w:r>
+    </w:p>
+    <w:p>
+      <w:pPr>
+        <w:pStyle w:val="BodyText"/>
+      </w:pPr>
+      <w:r>
+        <w:rPr>
+          <w:b/>
+        </w:rPr>
+        <w:t xml:space="preserve">Actions (Claude):</w:t>
+      </w:r>
+    </w:p>
+    <w:p>
+      <w:pPr>
+        <w:numPr>
+          <w:ilvl w:val="0"/>
+          <w:numId w:val="1014"/>
+        </w:numPr>
+        <w:pStyle w:val="Compact"/>
+      </w:pPr>
+      <w:r>
+        <w:t xml:space="preserve">Inspected existing</w:t>
+      </w:r>
+      <w:r>
+        <w:t xml:space="preserve"> </w:t>
+      </w:r>
+      <w:r>
+        <w:rPr>
+          <w:rStyle w:val="VerbatimChar"/>
+        </w:rPr>
+        <w:t xml:space="preserve">uiao-core/schemas/</w:t>
+      </w:r>
+      <w:r>
+        <w:t xml:space="preserve"> </w:t>
+      </w:r>
+      <w:r>
+        <w:t xml:space="preserve">— found subdirectory convention (</w:t>
+      </w:r>
+      <w:r>
+        <w:rPr>
+          <w:rStyle w:val="VerbatimChar"/>
+        </w:rPr>
+        <w:t xml:space="preserve">ksi/</w:t>
+      </w:r>
+      <w:r>
+        <w:t xml:space="preserve">,</w:t>
+      </w:r>
+      <w:r>
+        <w:t xml:space="preserve"> </w:t>
+      </w:r>
+      <w:r>
+        <w:rPr>
+          <w:rStyle w:val="VerbatimChar"/>
+        </w:rPr>
+        <w:t xml:space="preserve">udc/</w:t>
+      </w:r>
+      <w:r>
+        <w:t xml:space="preserve">,</w:t>
+      </w:r>
+      <w:r>
+        <w:t xml:space="preserve"> </w:t>
+      </w:r>
+      <w:r>
+        <w:rPr>
+          <w:rStyle w:val="VerbatimChar"/>
+        </w:rPr>
+        <w:t xml:space="preserve">uiao-api/</w:t>
+      </w:r>
+      <w:r>
+        <w:t xml:space="preserve">); created</w:t>
+      </w:r>
+      <w:r>
+        <w:t xml:space="preserve"> </w:t>
+      </w:r>
+      <w:r>
+        <w:rPr>
+          <w:rStyle w:val="VerbatimChar"/>
+        </w:rPr>
+        <w:t xml:space="preserve">schemas/adapter-registry/</w:t>
+      </w:r>
+      <w:r>
+        <w:t xml:space="preserve"> </w:t>
+      </w:r>
+      <w:r>
+        <w:t xml:space="preserve">to match.</w:t>
+      </w:r>
+    </w:p>
+    <w:p>
+      <w:pPr>
+        <w:numPr>
+          <w:ilvl w:val="0"/>
+          <w:numId w:val="1014"/>
+        </w:numPr>
+        <w:pStyle w:val="Compact"/>
+      </w:pPr>
+      <w:r>
+        <w:t xml:space="preserve">Created</w:t>
+      </w:r>
+      <w:r>
+        <w:t xml:space="preserve"> </w:t>
+      </w:r>
+      <w:r>
+        <w:rPr>
+          <w:rStyle w:val="VerbatimChar"/>
+          <w:b/>
+        </w:rPr>
+        <w:t xml:space="preserve">uiao-core/schemas/adapter-registry/adapter-registry.schema.json</w:t>
+      </w:r>
+      <w:r>
+        <w:t xml:space="preserve"> </w:t>
+      </w:r>
+      <w:r>
+        <w:t xml:space="preserve">(JSON Schema draft-07) with:</w:t>
+      </w:r>
+    </w:p>
+    <w:p>
+      <w:pPr>
+        <w:numPr>
+          <w:ilvl w:val="1"/>
+          <w:numId w:val="1015"/>
+        </w:numPr>
+        <w:pStyle w:val="Compact"/>
+      </w:pPr>
+      <w:r>
+        <w:rPr>
+          <w:rStyle w:val="VerbatimChar"/>
+        </w:rPr>
+        <w:t xml:space="preserve">registry-class: modernization | conformance</w:t>
+      </w:r>
+      <w:r>
+        <w:t xml:space="preserve"> </w:t>
+      </w:r>
+      <w:r>
+        <w:t xml:space="preserve">at the registry level (pins each file to one operational axis).</w:t>
+      </w:r>
+    </w:p>
+    <w:p>
+      <w:pPr>
+        <w:numPr>
+          <w:ilvl w:val="1"/>
+          <w:numId w:val="1015"/>
+        </w:numPr>
+        <w:pStyle w:val="Compact"/>
+      </w:pPr>
+      <w:r>
+        <w:rPr>
+          <w:rStyle w:val="VerbatimChar"/>
+        </w:rPr>
+        <w:t xml:space="preserve">class: modernization | conformance</w:t>
+      </w:r>
+      <w:r>
+        <w:t xml:space="preserve"> </w:t>
+      </w:r>
+      <w:r>
+        <w:t xml:space="preserve">on every adapter entry (operational axis).</w:t>
+      </w:r>
+    </w:p>
+    <w:p>
+      <w:pPr>
+        <w:numPr>
+          <w:ilvl w:val="1"/>
+          <w:numId w:val="1015"/>
+        </w:numPr>
+        <w:pStyle w:val="Compact"/>
+      </w:pPr>
+      <w:r>
+        <w:rPr>
+          <w:rStyle w:val="VerbatimChar"/>
+        </w:rPr>
+        <w:t xml:space="preserve">mission-class: identity | telemetry | policy | enforcement | unmapped | mixed</w:t>
+      </w:r>
+      <w:r>
+        <w:t xml:space="preserve"> </w:t>
+      </w:r>
+      <w:r>
+        <w:t xml:space="preserve">on every adapter entry (doctrinal axis).</w:t>
+      </w:r>
+    </w:p>
+    <w:p>
+      <w:pPr>
+        <w:numPr>
+          <w:ilvl w:val="1"/>
+          <w:numId w:val="1015"/>
+        </w:numPr>
+        <w:pStyle w:val="Compact"/>
+      </w:pPr>
+      <w:r>
+        <w:rPr>
+          <w:rStyle w:val="VerbatimChar"/>
+        </w:rPr>
+        <w:t xml:space="preserve">mission-class-notes</w:t>
+      </w:r>
+      <w:r>
+        <w:t xml:space="preserve"> </w:t>
+      </w:r>
+      <w:r>
+        <w:t xml:space="preserve">required when mission-class is</w:t>
+      </w:r>
+      <w:r>
+        <w:t xml:space="preserve"> </w:t>
+      </w:r>
+      <w:r>
+        <w:rPr>
+          <w:rStyle w:val="VerbatimChar"/>
+        </w:rPr>
+        <w:t xml:space="preserve">unmapped</w:t>
+      </w:r>
+      <w:r>
+        <w:t xml:space="preserve"> </w:t>
+      </w:r>
+      <w:r>
+        <w:t xml:space="preserve">or</w:t>
+      </w:r>
+      <w:r>
+        <w:t xml:space="preserve"> </w:t>
+      </w:r>
+      <w:r>
+        <w:rPr>
+          <w:rStyle w:val="VerbatimChar"/>
+        </w:rPr>
+        <w:t xml:space="preserve">mixed</w:t>
+      </w:r>
+      <w:r>
+        <w:t xml:space="preserve"> </w:t>
+      </w:r>
+      <w:r>
+        <w:t xml:space="preserve">(enforced via</w:t>
+      </w:r>
+      <w:r>
+        <w:t xml:space="preserve"> </w:t>
+      </w:r>
+      <w:r>
+        <w:rPr>
+          <w:rStyle w:val="VerbatimChar"/>
+        </w:rPr>
+        <w:t xml:space="preserve">allOf</w:t>
+      </w:r>
+      <w:r>
+        <w:t xml:space="preserve">/</w:t>
+      </w:r>
+      <w:r>
+        <w:rPr>
+          <w:rStyle w:val="VerbatimChar"/>
+        </w:rPr>
+        <w:t xml:space="preserve">if</w:t>
+      </w:r>
+      <w:r>
+        <w:t xml:space="preserve">/</w:t>
+      </w:r>
+      <w:r>
+        <w:rPr>
+          <w:rStyle w:val="VerbatimChar"/>
+        </w:rPr>
+        <w:t xml:space="preserve">then</w:t>
+      </w:r>
+      <w:r>
+        <w:t xml:space="preserve">).</w:t>
+      </w:r>
+    </w:p>
+    <w:p>
+      <w:pPr>
+        <w:numPr>
+          <w:ilvl w:val="1"/>
+          <w:numId w:val="1015"/>
+        </w:numPr>
+        <w:pStyle w:val="Compact"/>
+      </w:pPr>
+      <w:r>
+        <w:rPr>
+          <w:rStyle w:val="VerbatimChar"/>
+        </w:rPr>
+        <w:t xml:space="preserve">successor</w:t>
+      </w:r>
+      <w:r>
+        <w:t xml:space="preserve"> </w:t>
+      </w:r>
+      <w:r>
+        <w:t xml:space="preserve">required when status is</w:t>
+      </w:r>
+      <w:r>
+        <w:t xml:space="preserve"> </w:t>
+      </w:r>
+      <w:r>
+        <w:rPr>
+          <w:rStyle w:val="VerbatimChar"/>
+        </w:rPr>
+        <w:t xml:space="preserve">deprecated</w:t>
+      </w:r>
+      <w:r>
+        <w:t xml:space="preserve"> </w:t>
+      </w:r>
+      <w:r>
+        <w:t xml:space="preserve">or</w:t>
+      </w:r>
+      <w:r>
+        <w:t xml:space="preserve"> </w:t>
+      </w:r>
+      <w:r>
+        <w:rPr>
+          <w:rStyle w:val="VerbatimChar"/>
+        </w:rPr>
+        <w:t xml:space="preserve">retired</w:t>
+      </w:r>
+      <w:r>
+        <w:t xml:space="preserve">.</w:t>
+      </w:r>
+    </w:p>
+    <w:p>
+      <w:pPr>
+        <w:numPr>
+          <w:ilvl w:val="1"/>
+          <w:numId w:val="1015"/>
+        </w:numPr>
+        <w:pStyle w:val="Compact"/>
+      </w:pPr>
+      <w:r>
+        <w:t xml:space="preserve">Canon invariant fields:</w:t>
+      </w:r>
+      <w:r>
+        <w:t xml:space="preserve"> </w:t>
+      </w:r>
+      <w:r>
+        <w:rPr>
+          <w:rStyle w:val="VerbatimChar"/>
+        </w:rPr>
+        <w:t xml:space="preserve">gcc-boundary</w:t>
+      </w:r>
+      <w:r>
+        <w:t xml:space="preserve"> </w:t>
+      </w:r>
+      <w:r>
+        <w:t xml:space="preserve">(enum pinning to</w:t>
+      </w:r>
+      <w:r>
+        <w:t xml:space="preserve"> </w:t>
+      </w:r>
+      <w:r>
+        <w:rPr>
+          <w:rStyle w:val="VerbatimChar"/>
+        </w:rPr>
+        <w:t xml:space="preserve">gcc-moderate</w:t>
+      </w:r>
+      <w:r>
+        <w:t xml:space="preserve"> </w:t>
+      </w:r>
+      <w:r>
+        <w:t xml:space="preserve">or</w:t>
+      </w:r>
+      <w:r>
+        <w:t xml:space="preserve"> </w:t>
+      </w:r>
+      <w:r>
+        <w:rPr>
+          <w:rStyle w:val="VerbatimChar"/>
+        </w:rPr>
+        <w:t xml:space="preserve">commercial-exception-amazon-connect</w:t>
+      </w:r>
+      <w:r>
+        <w:t xml:space="preserve">),</w:t>
+      </w:r>
+      <w:r>
+        <w:t xml:space="preserve"> </w:t>
+      </w:r>
+      <w:r>
+        <w:rPr>
+          <w:rStyle w:val="VerbatimChar"/>
+        </w:rPr>
+        <w:t xml:space="preserve">ssot-mutation</w:t>
+      </w:r>
+      <w:r>
+        <w:t xml:space="preserve"> </w:t>
+      </w:r>
+      <w:r>
+        <w:t xml:space="preserve">(enum locked to</w:t>
+      </w:r>
+      <w:r>
+        <w:t xml:space="preserve"> </w:t>
+      </w:r>
+      <w:r>
+        <w:rPr>
+          <w:rStyle w:val="VerbatimChar"/>
+        </w:rPr>
+        <w:t xml:space="preserve">never</w:t>
+      </w:r>
+      <w:r>
+        <w:t xml:space="preserve">),</w:t>
+      </w:r>
+      <w:r>
+        <w:t xml:space="preserve"> </w:t>
+      </w:r>
+      <w:r>
+        <w:rPr>
+          <w:rStyle w:val="VerbatimChar"/>
+        </w:rPr>
+        <w:t xml:space="preserve">certificate-anchored</w:t>
+      </w:r>
+      <w:r>
+        <w:t xml:space="preserve"> </w:t>
+      </w:r>
+      <w:r>
+        <w:t xml:space="preserve">(boolean, must be true),</w:t>
+      </w:r>
+      <w:r>
+        <w:t xml:space="preserve"> </w:t>
+      </w:r>
+      <w:r>
+        <w:rPr>
+          <w:rStyle w:val="VerbatimChar"/>
+        </w:rPr>
+        <w:t xml:space="preserve">object-identity-only</w:t>
+      </w:r>
+      <w:r>
+        <w:t xml:space="preserve"> </w:t>
+      </w:r>
+      <w:r>
+        <w:t xml:space="preserve">(boolean, must be true).</w:t>
+      </w:r>
+    </w:p>
+    <w:p>
+      <w:pPr>
+        <w:numPr>
+          <w:ilvl w:val="1"/>
+          <w:numId w:val="1015"/>
+        </w:numPr>
+        <w:pStyle w:val="Compact"/>
+      </w:pPr>
+      <w:r>
+        <w:t xml:space="preserve">Operational fields:</w:t>
+      </w:r>
+      <w:r>
+        <w:t xml:space="preserve"> </w:t>
+      </w:r>
+      <w:r>
+        <w:rPr>
+          <w:rStyle w:val="VerbatimChar"/>
+        </w:rPr>
+        <w:t xml:space="preserve">phase</w:t>
+      </w:r>
+      <w:r>
+        <w:t xml:space="preserve">,</w:t>
+      </w:r>
+      <w:r>
+        <w:t xml:space="preserve"> </w:t>
+      </w:r>
+      <w:r>
+        <w:rPr>
+          <w:rStyle w:val="VerbatimChar"/>
+        </w:rPr>
+        <w:t xml:space="preserve">vendor</w:t>
+      </w:r>
+      <w:r>
+        <w:t xml:space="preserve">,</w:t>
+      </w:r>
+      <w:r>
+        <w:t xml:space="preserve"> </w:t>
+      </w:r>
+      <w:r>
+        <w:rPr>
+          <w:rStyle w:val="VerbatimChar"/>
+        </w:rPr>
+        <w:t xml:space="preserve">license</w:t>
+      </w:r>
+      <w:r>
+        <w:t xml:space="preserve">,</w:t>
+      </w:r>
+      <w:r>
+        <w:t xml:space="preserve"> </w:t>
+      </w:r>
+      <w:r>
+        <w:rPr>
+          <w:rStyle w:val="VerbatimChar"/>
+        </w:rPr>
+        <w:t xml:space="preserve">runtime</w:t>
+      </w:r>
+      <w:r>
+        <w:t xml:space="preserve">,</w:t>
+      </w:r>
+      <w:r>
+        <w:t xml:space="preserve"> </w:t>
+      </w:r>
+      <w:r>
+        <w:rPr>
+          <w:rStyle w:val="VerbatimChar"/>
+        </w:rPr>
+        <w:t xml:space="preserve">runtime-version</w:t>
+      </w:r>
+      <w:r>
+        <w:t xml:space="preserve">,</w:t>
+      </w:r>
+      <w:r>
+        <w:t xml:space="preserve"> </w:t>
+      </w:r>
+      <w:r>
+        <w:rPr>
+          <w:rStyle w:val="VerbatimChar"/>
+        </w:rPr>
+        <w:t xml:space="preserve">runner-class</w:t>
+      </w:r>
+      <w:r>
+        <w:t xml:space="preserve">,</w:t>
+      </w:r>
+      <w:r>
+        <w:t xml:space="preserve"> </w:t>
+      </w:r>
+      <w:r>
+        <w:rPr>
+          <w:rStyle w:val="VerbatimChar"/>
+        </w:rPr>
+        <w:t xml:space="preserve">tenancy</w:t>
+      </w:r>
+      <w:r>
+        <w:t xml:space="preserve">,</w:t>
+      </w:r>
+      <w:r>
+        <w:t xml:space="preserve"> </w:t>
+      </w:r>
+      <w:r>
+        <w:rPr>
+          <w:rStyle w:val="VerbatimChar"/>
+        </w:rPr>
+        <w:t xml:space="preserve">policy-engine</w:t>
+      </w:r>
+      <w:r>
+        <w:t xml:space="preserve">,</w:t>
+      </w:r>
+      <w:r>
+        <w:t xml:space="preserve"> </w:t>
+      </w:r>
+      <w:r>
+        <w:rPr>
+          <w:rStyle w:val="VerbatimChar"/>
+        </w:rPr>
+        <w:t xml:space="preserve">policy-pin</w:t>
+      </w:r>
+      <w:r>
+        <w:t xml:space="preserve">,</w:t>
+      </w:r>
+      <w:r>
+        <w:t xml:space="preserve"> </w:t>
+      </w:r>
+      <w:r>
+        <w:rPr>
+          <w:rStyle w:val="VerbatimChar"/>
+        </w:rPr>
+        <w:t xml:space="preserve">scope</w:t>
+      </w:r>
+      <w:r>
+        <w:t xml:space="preserve">,</w:t>
+      </w:r>
+      <w:r>
+        <w:t xml:space="preserve"> </w:t>
+      </w:r>
+      <w:r>
+        <w:rPr>
+          <w:rStyle w:val="VerbatimChar"/>
+        </w:rPr>
+        <w:t xml:space="preserve">outputs</w:t>
+      </w:r>
+      <w:r>
+        <w:t xml:space="preserve">,</w:t>
+      </w:r>
+      <w:r>
+        <w:t xml:space="preserve"> </w:t>
+      </w:r>
+      <w:r>
+        <w:rPr>
+          <w:rStyle w:val="VerbatimChar"/>
+        </w:rPr>
+        <w:t xml:space="preserve">triggers</w:t>
+      </w:r>
+      <w:r>
+        <w:t xml:space="preserve">,</w:t>
+      </w:r>
+      <w:r>
+        <w:t xml:space="preserve"> </w:t>
+      </w:r>
+      <w:r>
+        <w:rPr>
+          <w:rStyle w:val="VerbatimChar"/>
+        </w:rPr>
+        <w:t xml:space="preserve">evidence-class</w:t>
+      </w:r>
+      <w:r>
+        <w:t xml:space="preserve">,</w:t>
+      </w:r>
+      <w:r>
+        <w:t xml:space="preserve"> </w:t>
+      </w:r>
+      <w:r>
+        <w:rPr>
+          <w:rStyle w:val="VerbatimChar"/>
+        </w:rPr>
+        <w:t xml:space="preserve">retention-years</w:t>
+      </w:r>
+      <w:r>
+        <w:t xml:space="preserve">,</w:t>
+      </w:r>
+      <w:r>
+        <w:t xml:space="preserve"> </w:t>
+      </w:r>
+      <w:r>
+        <w:rPr>
+          <w:rStyle w:val="VerbatimChar"/>
+        </w:rPr>
+        <w:t xml:space="preserve">controls</w:t>
+      </w:r>
+      <w:r>
+        <w:t xml:space="preserve"> </w:t>
+      </w:r>
+      <w:r>
+        <w:t xml:space="preserve">(NIST SP 800-53 pattern validation),</w:t>
+      </w:r>
+      <w:r>
+        <w:t xml:space="preserve"> </w:t>
+      </w:r>
+      <w:r>
+        <w:rPr>
+          <w:rStyle w:val="VerbatimChar"/>
+        </w:rPr>
+        <w:t xml:space="preserve">automation-domain</w:t>
+      </w:r>
+      <w:r>
+        <w:t xml:space="preserve"> </w:t>
+      </w:r>
+      <w:r>
+        <w:t xml:space="preserve">(NIST SP 800-137 Appendix D enum — all 11 canonical domains).</w:t>
+      </w:r>
+    </w:p>
+    <w:p>
+      <w:pPr>
+        <w:numPr>
+          <w:ilvl w:val="1"/>
+          <w:numId w:val="1015"/>
+        </w:numPr>
+        <w:pStyle w:val="Compact"/>
+      </w:pPr>
+      <w:r>
+        <w:rPr>
+          <w:rStyle w:val="VerbatimChar"/>
+        </w:rPr>
+        <w:t xml:space="preserve">additionalProperties: false</w:t>
+      </w:r>
+      <w:r>
+        <w:t xml:space="preserve"> </w:t>
+      </w:r>
+      <w:r>
+        <w:t xml:space="preserve">on both registry root and adapter entries (strict schema; any unknown field fails CI).</w:t>
+      </w:r>
+    </w:p>
+    <w:p>
+      <w:pPr>
+        <w:numPr>
+          <w:ilvl w:val="0"/>
+          <w:numId w:val="1014"/>
+        </w:numPr>
+        <w:pStyle w:val="Compact"/>
+      </w:pPr>
+      <w:r>
+        <w:t xml:space="preserve">Created</w:t>
+      </w:r>
+      <w:r>
+        <w:t xml:space="preserve"> </w:t>
+      </w:r>
+      <w:r>
+        <w:rPr>
+          <w:rStyle w:val="VerbatimChar"/>
+          <w:b/>
+        </w:rPr>
+        <w:t xml:space="preserve">uiao-core/canon/modernization-registry.yaml</w:t>
+      </w:r>
+      <w:r>
+        <w:t xml:space="preserve"> </w:t>
+      </w:r>
+      <w:r>
+        <w:t xml:space="preserve">(</w:t>
+      </w:r>
+      <w:r>
+        <w:rPr>
+          <w:rStyle w:val="VerbatimChar"/>
+        </w:rPr>
+        <w:t xml:space="preserve">registry-class: modernization</w:t>
+      </w:r>
+      <w:r>
+        <w:t xml:space="preserve">, 5 adapters):</w:t>
+      </w:r>
+    </w:p>
+    <w:p>
+      <w:pPr>
+        <w:numPr>
+          <w:ilvl w:val="1"/>
+          <w:numId w:val="1016"/>
+        </w:numPr>
+        <w:pStyle w:val="Compact"/>
+      </w:pPr>
+      <w:r>
+        <w:rPr>
+          <w:rStyle w:val="VerbatimChar"/>
+        </w:rPr>
+        <w:t xml:space="preserve">entra-id</w:t>
+      </w:r>
+      <w:r>
+        <w:t xml:space="preserve"> </w:t>
+      </w:r>
+      <w:r>
+        <w:t xml:space="preserve">— Microsoft Entra ID, active, phase-1, controls CM-8/IA-2/IA-4/AC-2.</w:t>
+      </w:r>
+    </w:p>
+    <w:p>
+      <w:pPr>
+        <w:numPr>
+          <w:ilvl w:val="1"/>
+          <w:numId w:val="1016"/>
+        </w:numPr>
+        <w:pStyle w:val="Compact"/>
+      </w:pPr>
+      <w:r>
+        <w:rPr>
+          <w:rStyle w:val="VerbatimChar"/>
+        </w:rPr>
+        <w:t xml:space="preserve">m365</w:t>
+      </w:r>
+      <w:r>
+        <w:t xml:space="preserve"> </w:t>
+      </w:r>
+      <w:r>
+        <w:t xml:space="preserve">— Microsoft 365 tenant (Graph API), active, phase-1, controls CM-2/CM-3/CM-8.</w:t>
+      </w:r>
+    </w:p>
+    <w:p>
+      <w:pPr>
+        <w:numPr>
+          <w:ilvl w:val="1"/>
+          <w:numId w:val="1016"/>
+        </w:numPr>
+        <w:pStyle w:val="Compact"/>
+      </w:pPr>
+      <w:r>
+        <w:rPr>
+          <w:rStyle w:val="VerbatimChar"/>
+        </w:rPr>
+        <w:t xml:space="preserve">service-now</w:t>
+      </w:r>
+      <w:r>
+        <w:t xml:space="preserve"> </w:t>
+      </w:r>
+      <w:r>
+        <w:t xml:space="preserve">— ServiceNow ITSM, active, phase-1, controls IR-4/IR-5/IR-6/CM-3, evidence-class</w:t>
+      </w:r>
+      <w:r>
+        <w:t xml:space="preserve"> </w:t>
+      </w:r>
+      <w:r>
+        <w:rPr>
+          <w:rStyle w:val="VerbatimChar"/>
+        </w:rPr>
+        <w:t xml:space="preserve">incident</w:t>
+      </w:r>
+      <w:r>
+        <w:t xml:space="preserve">.</w:t>
+      </w:r>
+    </w:p>
+    <w:p>
+      <w:pPr>
+        <w:numPr>
+          <w:ilvl w:val="1"/>
+          <w:numId w:val="1016"/>
+        </w:numPr>
+        <w:pStyle w:val="Compact"/>
+      </w:pPr>
+      <w:r>
+        <w:rPr>
+          <w:rStyle w:val="VerbatimChar"/>
+        </w:rPr>
+        <w:t xml:space="preserve">palo-alto</w:t>
+      </w:r>
+      <w:r>
+        <w:t xml:space="preserve"> </w:t>
+      </w:r>
+      <w:r>
+        <w:t xml:space="preserve">— Palo Alto NGFW, active, phase-1, controls SC-7/CM-7/AC-4, runner-class</w:t>
+      </w:r>
+      <w:r>
+        <w:t xml:space="preserve"> </w:t>
+      </w:r>
+      <w:r>
+        <w:rPr>
+          <w:rStyle w:val="VerbatimChar"/>
+        </w:rPr>
+        <w:t xml:space="preserve">on-prem-self-hosted</w:t>
+      </w:r>
+      <w:r>
+        <w:t xml:space="preserve">.</w:t>
+      </w:r>
+    </w:p>
+    <w:p>
+      <w:pPr>
+        <w:numPr>
+          <w:ilvl w:val="1"/>
+          <w:numId w:val="1016"/>
+        </w:numPr>
+        <w:pStyle w:val="Compact"/>
+      </w:pPr>
+      <w:r>
+        <w:rPr>
+          <w:rStyle w:val="VerbatimChar"/>
+        </w:rPr>
+        <w:t xml:space="preserve">scuba</w:t>
+      </w:r>
+      <w:r>
+        <w:t xml:space="preserve"> </w:t>
+      </w:r>
+      <w:r>
+        <w:t xml:space="preserve">— CISA SCuBA baseline (target state — distinct from the assessment tool), active, phase-1, controls CM-2/CM-6/CM-7.</w:t>
+      </w:r>
+    </w:p>
+    <w:p>
+      <w:pPr>
+        <w:numPr>
+          <w:ilvl w:val="1"/>
+          <w:numId w:val="1016"/>
+        </w:numPr>
+        <w:pStyle w:val="Compact"/>
+      </w:pPr>
+      <w:r>
+        <w:t xml:space="preserve">All 5 declare</w:t>
+      </w:r>
+      <w:r>
+        <w:t xml:space="preserve"> </w:t>
+      </w:r>
+      <w:r>
+        <w:rPr>
+          <w:rStyle w:val="VerbatimChar"/>
+        </w:rPr>
+        <w:t xml:space="preserve">mission-class: unmapped</w:t>
+      </w:r>
+      <w:r>
+        <w:t xml:space="preserve"> </w:t>
+      </w:r>
+      <w:r>
+        <w:t xml:space="preserve">with</w:t>
+      </w:r>
+      <w:r>
+        <w:t xml:space="preserve"> </w:t>
+      </w:r>
+      <w:r>
+        <w:rPr>
+          <w:rStyle w:val="VerbatimChar"/>
+        </w:rPr>
+        <w:t xml:space="preserve">mission-class-notes</w:t>
+      </w:r>
+      <w:r>
+        <w:t xml:space="preserve"> </w:t>
+      </w:r>
+      <w:r>
+        <w:t xml:space="preserve">referencing ODA-15.</w:t>
+      </w:r>
+    </w:p>
+    <w:p>
+      <w:pPr>
+        <w:numPr>
+          <w:ilvl w:val="0"/>
+          <w:numId w:val="1014"/>
+        </w:numPr>
+        <w:pStyle w:val="Compact"/>
+      </w:pPr>
+      <w:r>
+        <w:t xml:space="preserve">Created</w:t>
+      </w:r>
+      <w:r>
+        <w:t xml:space="preserve"> </w:t>
+      </w:r>
+      <w:r>
+        <w:rPr>
+          <w:rStyle w:val="VerbatimChar"/>
+          <w:b/>
+        </w:rPr>
+        <w:t xml:space="preserve">uiao-core/canon/adapter-registry.yaml</w:t>
+      </w:r>
+      <w:r>
+        <w:t xml:space="preserve"> </w:t>
+      </w:r>
+      <w:r>
+        <w:t xml:space="preserve">(</w:t>
+      </w:r>
+      <w:r>
+        <w:rPr>
+          <w:rStyle w:val="VerbatimChar"/>
+        </w:rPr>
+        <w:t xml:space="preserve">registry-class: conformance</w:t>
+      </w:r>
+      <w:r>
+        <w:t xml:space="preserve">, 4 slots):</w:t>
+      </w:r>
+    </w:p>
+    <w:p>
+      <w:pPr>
+        <w:numPr>
+          <w:ilvl w:val="1"/>
+          <w:numId w:val="1017"/>
+        </w:numPr>
+        <w:pStyle w:val="Compact"/>
+      </w:pPr>
+      <w:r>
+        <w:rPr>
+          <w:rStyle w:val="VerbatimChar"/>
+        </w:rPr>
+        <w:t xml:space="preserve">scubagear</w:t>
+      </w:r>
+      <w:r>
+        <w:t xml:space="preserve"> </w:t>
+      </w:r>
+      <w:r>
+        <w:t xml:space="preserve">—</w:t>
+      </w:r>
+      <w:r>
+        <w:t xml:space="preserve"> </w:t>
+      </w:r>
+      <w:r>
+        <w:rPr>
+          <w:b/>
+        </w:rPr>
+        <w:t xml:space="preserve">active</w:t>
+      </w:r>
+      <w:r>
+        <w:t xml:space="preserve">, phase-1,</w:t>
+      </w:r>
+      <w:r>
+        <w:t xml:space="preserve"> </w:t>
+      </w:r>
+      <w:r>
+        <w:rPr>
+          <w:rStyle w:val="VerbatimChar"/>
+        </w:rPr>
+        <w:t xml:space="preserve">mission-class: policy</w:t>
+      </w:r>
+      <w:r>
+        <w:t xml:space="preserve">, runtime</w:t>
+      </w:r>
+      <w:r>
+        <w:t xml:space="preserve"> </w:t>
+      </w:r>
+      <w:r>
+        <w:rPr>
+          <w:rStyle w:val="VerbatimChar"/>
+        </w:rPr>
+        <w:t xml:space="preserve">powershell-7.4</w:t>
+      </w:r>
+      <w:r>
+        <w:t xml:space="preserve"> </w:t>
+      </w:r>
+      <w:r>
+        <w:t xml:space="preserve">pinned</w:t>
+      </w:r>
+      <w:r>
+        <w:t xml:space="preserve"> </w:t>
+      </w:r>
+      <w:r>
+        <w:rPr>
+          <w:rStyle w:val="VerbatimChar"/>
+        </w:rPr>
+        <w:t xml:space="preserve">1.5.1</w:t>
+      </w:r>
+      <w:r>
+        <w:t xml:space="preserve">, policy-engine</w:t>
+      </w:r>
+      <w:r>
+        <w:t xml:space="preserve"> </w:t>
+      </w:r>
+      <w:r>
+        <w:rPr>
+          <w:rStyle w:val="VerbatimChar"/>
+        </w:rPr>
+        <w:t xml:space="preserve">opa-rego</w:t>
+      </w:r>
+      <w:r>
+        <w:t xml:space="preserve">, policy-pin</w:t>
+      </w:r>
+      <w:r>
+        <w:t xml:space="preserve"> </w:t>
+      </w:r>
+      <w:r>
+        <w:rPr>
+          <w:rStyle w:val="VerbatimChar"/>
+        </w:rPr>
+        <w:t xml:space="preserve">main</w:t>
+      </w:r>
+      <w:r>
+        <w:t xml:space="preserve"> </w:t>
+      </w:r>
+      <w:r>
+        <w:t xml:space="preserve">(with monthly bump per CONMON.md §6), scope</w:t>
+      </w:r>
+      <w:r>
+        <w:t xml:space="preserve"> </w:t>
+      </w:r>
+      <w:r>
+        <w:rPr>
+          <w:rStyle w:val="VerbatimChar"/>
+        </w:rPr>
+        <w:t xml:space="preserve">[aad, defender, exo, powerbi, powerplatform, sharepoint, teams]</w:t>
+      </w:r>
+      <w:r>
+        <w:t xml:space="preserve">, controls CA-2/CA-5/CA-7/CM-6/CM-8/RA-5, automation-domain</w:t>
+      </w:r>
+      <w:r>
+        <w:t xml:space="preserve"> </w:t>
+      </w:r>
+      <w:r>
+        <w:rPr>
+          <w:rStyle w:val="VerbatimChar"/>
+        </w:rPr>
+        <w:t xml:space="preserve">configuration-management</w:t>
+      </w:r>
+      <w:r>
+        <w:t xml:space="preserve">, references ADR-025.</w:t>
+      </w:r>
+    </w:p>
+    <w:p>
+      <w:pPr>
+        <w:numPr>
+          <w:ilvl w:val="1"/>
+          <w:numId w:val="1017"/>
+        </w:numPr>
+        <w:pStyle w:val="Compact"/>
+      </w:pPr>
+      <w:r>
+        <w:rPr>
+          <w:rStyle w:val="VerbatimChar"/>
+        </w:rPr>
+        <w:t xml:space="preserve">vuln-scan</w:t>
+      </w:r>
+      <w:r>
+        <w:t xml:space="preserve"> </w:t>
+      </w:r>
+      <w:r>
+        <w:t xml:space="preserve">—</w:t>
+      </w:r>
+      <w:r>
+        <w:t xml:space="preserve"> </w:t>
+      </w:r>
+      <w:r>
+        <w:rPr>
+          <w:b/>
+        </w:rPr>
+        <w:t xml:space="preserve">reserved</w:t>
+      </w:r>
+      <w:r>
+        <w:t xml:space="preserve">, phase-planning,</w:t>
+      </w:r>
+      <w:r>
+        <w:t xml:space="preserve"> </w:t>
+      </w:r>
+      <w:r>
+        <w:rPr>
+          <w:rStyle w:val="VerbatimChar"/>
+        </w:rPr>
+        <w:t xml:space="preserve">mission-class: telemetry</w:t>
+      </w:r>
+      <w:r>
+        <w:t xml:space="preserve">, controls RA-5/RA-5(5)/CA-7/SI-2, automation-domain</w:t>
+      </w:r>
+      <w:r>
+        <w:t xml:space="preserve"> </w:t>
+      </w:r>
+      <w:r>
+        <w:rPr>
+          <w:rStyle w:val="VerbatimChar"/>
+        </w:rPr>
+        <w:t xml:space="preserve">vulnerability-management</w:t>
+      </w:r>
+      <w:r>
+        <w:t xml:space="preserve">.</w:t>
+      </w:r>
+    </w:p>
+    <w:p>
+      <w:pPr>
+        <w:numPr>
+          <w:ilvl w:val="1"/>
+          <w:numId w:val="1017"/>
+        </w:numPr>
+        <w:pStyle w:val="Compact"/>
+      </w:pPr>
+      <w:r>
+        <w:rPr>
+          <w:rStyle w:val="VerbatimChar"/>
+        </w:rPr>
+        <w:t xml:space="preserve">stig-compliance</w:t>
+      </w:r>
+      <w:r>
+        <w:t xml:space="preserve"> </w:t>
+      </w:r>
+      <w:r>
+        <w:t xml:space="preserve">—</w:t>
+      </w:r>
+      <w:r>
+        <w:t xml:space="preserve"> </w:t>
+      </w:r>
+      <w:r>
+        <w:rPr>
+          <w:b/>
+        </w:rPr>
+        <w:t xml:space="preserve">reserved</w:t>
+      </w:r>
+      <w:r>
+        <w:t xml:space="preserve">, phase-planning,</w:t>
+      </w:r>
+      <w:r>
+        <w:t xml:space="preserve"> </w:t>
+      </w:r>
+      <w:r>
+        <w:rPr>
+          <w:rStyle w:val="VerbatimChar"/>
+        </w:rPr>
+        <w:t xml:space="preserve">mission-class: policy</w:t>
+      </w:r>
+      <w:r>
+        <w:t xml:space="preserve">, controls CM-6/CM-7/CA-7, automation-domain</w:t>
+      </w:r>
+      <w:r>
+        <w:t xml:space="preserve"> </w:t>
+      </w:r>
+      <w:r>
+        <w:rPr>
+          <w:rStyle w:val="VerbatimChar"/>
+        </w:rPr>
+        <w:t xml:space="preserve">configuration-management</w:t>
+      </w:r>
+      <w:r>
+        <w:t xml:space="preserve">.</w:t>
+      </w:r>
+    </w:p>
+    <w:p>
+      <w:pPr>
+        <w:numPr>
+          <w:ilvl w:val="1"/>
+          <w:numId w:val="1017"/>
+        </w:numPr>
+        <w:pStyle w:val="Compact"/>
+      </w:pPr>
+      <w:r>
+        <w:rPr>
+          <w:rStyle w:val="VerbatimChar"/>
+        </w:rPr>
+        <w:t xml:space="preserve">patch-state</w:t>
+      </w:r>
+      <w:r>
+        <w:t xml:space="preserve"> </w:t>
+      </w:r>
+      <w:r>
+        <w:t xml:space="preserve">—</w:t>
+      </w:r>
+      <w:r>
+        <w:t xml:space="preserve"> </w:t>
+      </w:r>
+      <w:r>
+        <w:rPr>
+          <w:b/>
+        </w:rPr>
+        <w:t xml:space="preserve">reserved</w:t>
+      </w:r>
+      <w:r>
+        <w:t xml:space="preserve">, phase-planning,</w:t>
+      </w:r>
+      <w:r>
+        <w:t xml:space="preserve"> </w:t>
+      </w:r>
+      <w:r>
+        <w:rPr>
+          <w:rStyle w:val="VerbatimChar"/>
+        </w:rPr>
+        <w:t xml:space="preserve">mission-class: telemetry</w:t>
+      </w:r>
+      <w:r>
+        <w:t xml:space="preserve">, controls SI-2/CM-8/CA-7, automation-domain</w:t>
+      </w:r>
+      <w:r>
+        <w:t xml:space="preserve"> </w:t>
+      </w:r>
+      <w:r>
+        <w:rPr>
+          <w:rStyle w:val="VerbatimChar"/>
+        </w:rPr>
+        <w:t xml:space="preserve">patch-management</w:t>
+      </w:r>
+      <w:r>
+        <w:t xml:space="preserve">.</w:t>
+      </w:r>
+    </w:p>
+    <w:p>
+      <w:pPr>
+        <w:numPr>
+          <w:ilvl w:val="0"/>
+          <w:numId w:val="1014"/>
+        </w:numPr>
+        <w:pStyle w:val="Compact"/>
+      </w:pPr>
+      <w:r>
+        <w:rPr>
+          <w:b/>
+        </w:rPr>
+        <w:t xml:space="preserve">Validated both YAMLs</w:t>
+      </w:r>
+      <w:r>
+        <w:t xml:space="preserve"> </w:t>
+      </w:r>
+      <w:r>
+        <w:t xml:space="preserve">against the schema with a Draft-07 validator (</w:t>
+      </w:r>
+      <w:r>
+        <w:rPr>
+          <w:rStyle w:val="VerbatimChar"/>
+        </w:rPr>
+        <w:t xml:space="preserve">jsonschema</w:t>
+      </w:r>
+      <w:r>
+        <w:t xml:space="preserve"> </w:t>
+      </w:r>
+      <w:r>
+        <w:t xml:space="preserve">+</w:t>
+      </w:r>
+      <w:r>
+        <w:t xml:space="preserve"> </w:t>
+      </w:r>
+      <w:r>
+        <w:rPr>
+          <w:rStyle w:val="VerbatimChar"/>
+        </w:rPr>
+        <w:t xml:space="preserve">pyyaml</w:t>
+      </w:r>
+      <w:r>
+        <w:t xml:space="preserve">,</w:t>
+      </w:r>
+      <w:r>
+        <w:t xml:space="preserve"> </w:t>
+      </w:r>
+      <w:r>
+        <w:rPr>
+          <w:rStyle w:val="VerbatimChar"/>
+        </w:rPr>
+        <w:t xml:space="preserve">--break-system-packages</w:t>
+      </w:r>
+      <w:r>
+        <w:t xml:space="preserve">):</w:t>
+      </w:r>
+    </w:p>
+    <w:p>
+      <w:pPr>
+        <w:numPr>
+          <w:ilvl w:val="1"/>
+          <w:numId w:val="1018"/>
+        </w:numPr>
+        <w:pStyle w:val="Compact"/>
+      </w:pPr>
+      <w:r>
+        <w:t xml:space="preserve">Initial failure:</w:t>
+      </w:r>
+      <w:r>
+        <w:t xml:space="preserve"> </w:t>
+      </w:r>
+      <w:r>
+        <w:rPr>
+          <w:rStyle w:val="VerbatimChar"/>
+        </w:rPr>
+        <w:t xml:space="preserve">updated: 2026-04-14</w:t>
+      </w:r>
+      <w:r>
+        <w:t xml:space="preserve"> </w:t>
+      </w:r>
+      <w:r>
+        <w:t xml:space="preserve">parsed as</w:t>
+      </w:r>
+      <w:r>
+        <w:t xml:space="preserve"> </w:t>
+      </w:r>
+      <w:r>
+        <w:rPr>
+          <w:rStyle w:val="VerbatimChar"/>
+        </w:rPr>
+        <w:t xml:space="preserve">datetime.date</w:t>
+      </w:r>
+      <w:r>
+        <w:t xml:space="preserve"> </w:t>
+      </w:r>
+      <w:r>
+        <w:t xml:space="preserve">(PyYAML default), schema expected</w:t>
+      </w:r>
+      <w:r>
+        <w:t xml:space="preserve"> </w:t>
+      </w:r>
+      <w:r>
+        <w:rPr>
+          <w:rStyle w:val="VerbatimChar"/>
+        </w:rPr>
+        <w:t xml:space="preserve">string</w:t>
+      </w:r>
+      <w:r>
+        <w:t xml:space="preserve">. Fix: quoted the date value in both YAMLs.</w:t>
+      </w:r>
+    </w:p>
+    <w:p>
+      <w:pPr>
+        <w:numPr>
+          <w:ilvl w:val="1"/>
+          <w:numId w:val="1018"/>
+        </w:numPr>
+        <w:pStyle w:val="Compact"/>
+      </w:pPr>
+      <w:r>
+        <w:t xml:space="preserve">Final result:</w:t>
+      </w:r>
+      <w:r>
+        <w:t xml:space="preserve"> </w:t>
+      </w:r>
+      <w:r>
+        <w:rPr>
+          <w:b/>
+        </w:rPr>
+        <w:t xml:space="preserve">both files clean, 9 adapters total (5 modernization + 4 conformance).</w:t>
+      </w:r>
+      <w:r>
+        <w:t xml:space="preserve"> </w:t>
+      </w:r>
+      <w:r>
+        <w:t xml:space="preserve">Mission-class distribution: 5 unmapped (all modernization, pending ODA-15), 2 policy (scubagear, stig-compliance), 2 telemetry (vuln-scan, patch-state).</w:t>
+      </w:r>
+    </w:p>
+    <w:p>
+      <w:pPr>
+        <w:numPr>
+          <w:ilvl w:val="0"/>
+          <w:numId w:val="1014"/>
+        </w:numPr>
+        <w:pStyle w:val="Compact"/>
+      </w:pPr>
+      <w:r>
+        <w:t xml:space="preserve">Updated</w:t>
+      </w:r>
+      <w:r>
+        <w:t xml:space="preserve"> </w:t>
+      </w:r>
+      <w:r>
+        <w:rPr>
+          <w:rStyle w:val="VerbatimChar"/>
+          <w:b/>
+        </w:rPr>
+        <w:t xml:space="preserve">uiao-core/ARCHITECTURE.md</w:t>
+      </w:r>
+      <w:r>
+        <w:t xml:space="preserve">:</w:t>
+      </w:r>
+    </w:p>
+    <w:p>
+      <w:pPr>
+        <w:numPr>
+          <w:ilvl w:val="1"/>
+          <w:numId w:val="1019"/>
+        </w:numPr>
+        <w:pStyle w:val="Compact"/>
+      </w:pPr>
+      <w:r>
+        <w:t xml:space="preserve">§3.1 file-listing block rewritten to show the real on-disk layout (two YAML files in</w:t>
+      </w:r>
+      <w:r>
+        <w:t xml:space="preserve"> </w:t>
+      </w:r>
+      <w:r>
+        <w:rPr>
+          <w:rStyle w:val="VerbatimChar"/>
+        </w:rPr>
+        <w:t xml:space="preserve">canon/</w:t>
+      </w:r>
+      <w:r>
+        <w:t xml:space="preserve">, schema in</w:t>
+      </w:r>
+      <w:r>
+        <w:t xml:space="preserve"> </w:t>
+      </w:r>
+      <w:r>
+        <w:rPr>
+          <w:rStyle w:val="VerbatimChar"/>
+        </w:rPr>
+        <w:t xml:space="preserve">schemas/adapter-registry/</w:t>
+      </w:r>
+      <w:r>
+        <w:t xml:space="preserve">).</w:t>
+      </w:r>
+    </w:p>
+    <w:p>
+      <w:pPr>
+        <w:numPr>
+          <w:ilvl w:val="1"/>
+          <w:numId w:val="1019"/>
+        </w:numPr>
+        <w:pStyle w:val="Compact"/>
+      </w:pPr>
+      <w:r>
+        <w:t xml:space="preserve">§3.2 retitled from</w:t>
+      </w:r>
+      <w:r>
+        <w:t xml:space="preserve"> </w:t>
+      </w:r>
+      <w:r>
+        <w:t xml:space="preserve">“</w:t>
+      </w:r>
+      <w:r>
+        <w:t xml:space="preserve">Adapter registry schema (NEW, Proposed)</w:t>
+      </w:r>
+      <w:r>
+        <w:t xml:space="preserve">”</w:t>
+      </w:r>
+      <w:r>
+        <w:t xml:space="preserve"> </w:t>
+      </w:r>
+      <w:r>
+        <w:t xml:space="preserve">to</w:t>
+      </w:r>
+      <w:r>
+        <w:t xml:space="preserve"> </w:t>
+      </w:r>
+      <w:r>
+        <w:t xml:space="preserve">“</w:t>
+      </w:r>
+      <w:r>
+        <w:t xml:space="preserve">Adapter registry schema — dual-axis taxonomy</w:t>
+      </w:r>
+      <w:r>
+        <w:t xml:space="preserve">”</w:t>
+      </w:r>
+      <w:r>
+        <w:t xml:space="preserve">. New prose explains why two axes exist, what each one encodes, and why separation matters (prevents the operational choice from ratifying the doctrinal one; lets UIAO_003 evolve without forcing a registry migration). YAML excerpt rewritten to show both a modernization entry (entra-id) and a conformance entry (scubagear) with their full invariant fields.</w:t>
+      </w:r>
+    </w:p>
+    <w:p>
+      <w:pPr>
+        <w:numPr>
+          <w:ilvl w:val="1"/>
+          <w:numId w:val="1019"/>
+        </w:numPr>
+        <w:pStyle w:val="Compact"/>
+      </w:pPr>
+      <w:r>
+        <w:t xml:space="preserve">§13 — added</w:t>
+      </w:r>
+      <w:r>
+        <w:t xml:space="preserve"> </w:t>
+      </w:r>
+      <w:r>
+        <w:rPr>
+          <w:b/>
+        </w:rPr>
+        <w:t xml:space="preserve">ODA-15</w:t>
+      </w:r>
+      <w:r>
+        <w:t xml:space="preserve"> </w:t>
+      </w:r>
+      <w:r>
+        <w:t xml:space="preserve">describing the modernization mission-class gap with three resolution options: (a) add a fifth canonical class</w:t>
+      </w:r>
+      <w:r>
+        <w:t xml:space="preserve"> </w:t>
+      </w:r>
+      <w:r>
+        <w:t xml:space="preserve">“</w:t>
+      </w:r>
+      <w:r>
+        <w:t xml:space="preserve">Integration</w:t>
+      </w:r>
+      <w:r>
+        <w:t xml:space="preserve">”</w:t>
+      </w:r>
+      <w:r>
+        <w:t xml:space="preserve"> </w:t>
+      </w:r>
+      <w:r>
+        <w:t xml:space="preserve">to UIAO_003, (b) re-scope</w:t>
+      </w:r>
+      <w:r>
+        <w:t xml:space="preserve"> </w:t>
+      </w:r>
+      <w:r>
+        <w:rPr>
+          <w:rStyle w:val="VerbatimChar"/>
+        </w:rPr>
+        <w:t xml:space="preserve">enforcement</w:t>
+      </w:r>
+      <w:r>
+        <w:t xml:space="preserve"> </w:t>
+      </w:r>
+      <w:r>
+        <w:t xml:space="preserve">to cover target-environment changes, or (c) accept</w:t>
+      </w:r>
+      <w:r>
+        <w:t xml:space="preserve"> </w:t>
+      </w:r>
+      <w:r>
+        <w:rPr>
+          <w:rStyle w:val="VerbatimChar"/>
+        </w:rPr>
+        <w:t xml:space="preserve">unmapped</w:t>
+      </w:r>
+      <w:r>
+        <w:t xml:space="preserve"> </w:t>
+      </w:r>
+      <w:r>
+        <w:t xml:space="preserve">permanently as the dual-axis model’s final answer.</w:t>
+      </w:r>
+    </w:p>
+    <w:p>
+      <w:pPr>
+        <w:numPr>
+          <w:ilvl w:val="1"/>
+          <w:numId w:val="1019"/>
+        </w:numPr>
+        <w:pStyle w:val="Compact"/>
+      </w:pPr>
+      <w:r>
+        <w:t xml:space="preserve">§14 change-log — added 0.5.0 entry for</w:t>
+      </w:r>
+      <w:r>
+        <w:t xml:space="preserve"> </w:t>
+      </w:r>
+      <w:r>
+        <w:t xml:space="preserve">“</w:t>
+      </w:r>
+      <w:r>
+        <w:t xml:space="preserve">Step 0a — Adapter registries landed</w:t>
+      </w:r>
+      <w:r>
+        <w:t xml:space="preserve">”</w:t>
+      </w:r>
+      <w:r>
+        <w:t xml:space="preserve">.</w:t>
+      </w:r>
+    </w:p>
+    <w:p>
+      <w:pPr>
+        <w:pStyle w:val="FirstParagraph"/>
+      </w:pPr>
+      <w:r>
+        <w:rPr>
+          <w:b/>
+        </w:rPr>
+        <w:t xml:space="preserve">Files touched:</w:t>
+      </w:r>
+    </w:p>
+    <w:tbl>
+      <w:tblPr>
+        <w:tblStyle w:val="Table"/>
+        <w:tblW w:type="pct" w:w="5000.0"/>
+        <w:tblLook w:firstRow="1"/>
+      </w:tblPr>
+      <w:tblGrid>
+        <w:gridCol w:w="3960"/>
+        <w:gridCol w:w="3960"/>
+      </w:tblGrid>
+      <w:tr>
+        <w:trPr>
+          <w:cnfStyle w:firstRow="1"/>
+        </w:trPr>
+        <w:tc>
+          <w:tcPr>
+            <w:tcBorders>
+              <w:bottom w:val="single"/>
+            </w:tcBorders>
+            <w:vAlign w:val="bottom"/>
+          </w:tcPr>
+          <w:p>
+            <w:pPr>
+              <w:pStyle w:val="Compact"/>
+              <w:jc w:val="left"/>
+            </w:pPr>
+            <w:r>
+              <w:t xml:space="preserve">Path</w:t>
+            </w:r>
+          </w:p>
+        </w:tc>
+        <w:tc>
+          <w:tcPr>
+            <w:tcBorders>
+              <w:bottom w:val="single"/>
+            </w:tcBorders>
+            <w:vAlign w:val="bottom"/>
+          </w:tcPr>
+          <w:p>
+            <w:pPr>
+              <w:pStyle w:val="Compact"/>
+              <w:jc w:val="left"/>
+            </w:pPr>
+            <w:r>
+              <w:t xml:space="preserve">Action</w:t>
+            </w:r>
+          </w:p>
+        </w:tc>
+      </w:tr>
+      <w:tr>
+        <w:tc>
+          <w:p>
+            <w:pPr>
+              <w:pStyle w:val="Compact"/>
+              <w:jc w:val="left"/>
+            </w:pPr>
+            <w:r>
+              <w:rPr>
+                <w:rStyle w:val="VerbatimChar"/>
+              </w:rPr>
+              <w:t xml:space="preserve">uiao-core/schemas/adapter-registry/adapter-registry.schema.json</w:t>
+            </w:r>
+          </w:p>
+        </w:tc>
+        <w:tc>
+          <w:p>
+            <w:pPr>
+              <w:pStyle w:val="Compact"/>
+              <w:jc w:val="left"/>
+            </w:pPr>
+            <w:r>
+              <w:t xml:space="preserve">new</w:t>
+            </w:r>
+          </w:p>
+        </w:tc>
+      </w:tr>
+      <w:tr>
+        <w:tc>
+          <w:p>
+            <w:pPr>
+              <w:pStyle w:val="Compact"/>
+              <w:jc w:val="left"/>
+            </w:pPr>
+            <w:r>
+              <w:rPr>
+                <w:rStyle w:val="VerbatimChar"/>
+              </w:rPr>
+              <w:t xml:space="preserve">uiao-core/canon/modernization-registry.yaml</w:t>
+            </w:r>
+          </w:p>
+        </w:tc>
+        <w:tc>
+          <w:p>
+            <w:pPr>
+              <w:pStyle w:val="Compact"/>
+              <w:jc w:val="left"/>
+            </w:pPr>
+            <w:r>
+              <w:t xml:space="preserve">new</w:t>
+            </w:r>
+          </w:p>
+        </w:tc>
+      </w:tr>
+      <w:tr>
+        <w:tc>
+          <w:p>
+            <w:pPr>
+              <w:pStyle w:val="Compact"/>
+              <w:jc w:val="left"/>
+            </w:pPr>
+            <w:r>
+              <w:rPr>
+                <w:rStyle w:val="VerbatimChar"/>
+              </w:rPr>
+              <w:t xml:space="preserve">uiao-core/canon/adapter-registry.yaml</w:t>
+            </w:r>
+          </w:p>
+        </w:tc>
+        <w:tc>
+          <w:p>
+            <w:pPr>
+              <w:pStyle w:val="Compact"/>
+              <w:jc w:val="left"/>
+            </w:pPr>
+            <w:r>
+              <w:t xml:space="preserve">new</w:t>
+            </w:r>
+          </w:p>
+        </w:tc>
+      </w:tr>
+      <w:tr>
+        <w:tc>
+          <w:p>
+            <w:pPr>
+              <w:pStyle w:val="Compact"/>
+              <w:jc w:val="left"/>
+            </w:pPr>
+            <w:r>
+              <w:rPr>
+                <w:rStyle w:val="VerbatimChar"/>
+              </w:rPr>
+              <w:t xml:space="preserve">uiao-core/ARCHITECTURE.md</w:t>
+            </w:r>
+          </w:p>
+        </w:tc>
+        <w:tc>
+          <w:p>
+            <w:pPr>
+              <w:pStyle w:val="Compact"/>
+              <w:jc w:val="left"/>
+            </w:pPr>
+            <w:r>
+              <w:t xml:space="preserve">updated (§3.1, §3.2, §13, §14)</w:t>
+            </w:r>
+          </w:p>
+        </w:tc>
+      </w:tr>
+      <w:tr>
+        <w:tc>
+          <w:p>
+            <w:pPr>
+              <w:pStyle w:val="Compact"/>
+              <w:jc w:val="left"/>
+            </w:pPr>
+            <w:r>
+              <w:rPr>
+                <w:rStyle w:val="VerbatimChar"/>
+              </w:rPr>
+              <w:t xml:space="preserve">uiao-docs/docs/session-logs/2026-04-14-customer-docs-platform.md</w:t>
+            </w:r>
+          </w:p>
+        </w:tc>
+        <w:tc>
+          <w:p>
+            <w:pPr>
+              <w:pStyle w:val="Compact"/>
+              <w:jc w:val="left"/>
+            </w:pPr>
+            <w:r>
+              <w:t xml:space="preserve">updated (this append)</w:t>
+            </w:r>
+          </w:p>
+        </w:tc>
+      </w:tr>
+      <w:tr>
+        <w:tc>
+          <w:p>
+            <w:pPr>
+              <w:pStyle w:val="Compact"/>
+              <w:jc w:val="left"/>
+            </w:pPr>
+            <w:r>
+              <w:rPr>
+                <w:rStyle w:val="VerbatimChar"/>
+              </w:rPr>
+              <w:t xml:space="preserve">uiao-docs/docs/session-logs/2026-04-14-customer-docs-platform.docx</w:t>
+            </w:r>
+          </w:p>
+        </w:tc>
+        <w:tc>
+          <w:p>
+            <w:pPr>
+              <w:pStyle w:val="Compact"/>
+              <w:jc w:val="left"/>
+            </w:pPr>
+            <w:r>
+              <w:t xml:space="preserve">regenerated via pandoc</w:t>
+            </w:r>
+          </w:p>
+        </w:tc>
+      </w:tr>
+    </w:tbl>
+    <w:p>
+      <w:pPr>
+        <w:pStyle w:val="BodyText"/>
+      </w:pPr>
+      <w:r>
+        <w:rPr>
+          <w:b/>
+        </w:rPr>
+        <w:t xml:space="preserve">Commit hand-off (PowerShell):</w:t>
+      </w:r>
+    </w:p>
+    <w:p>
+      <w:pPr>
+        <w:pStyle w:val="SourceCode"/>
+      </w:pPr>
+      <w:r>
+        <w:rPr>
+          <w:rStyle w:val="CommentTok"/>
+        </w:rPr>
+        <w:t xml:space="preserve"># uiao-core — Step 0a registries + schema + ARCHITECTURE.md dual-axis</w:t>
+      </w:r>
+      <w:r>
+        <w:br/>
+      </w:r>
+      <w:r>
+        <w:rPr>
+          <w:rStyle w:val="FunctionTok"/>
+        </w:rPr>
+        <w:t xml:space="preserve">Set-Location</w:t>
+      </w:r>
+      <w:r>
+        <w:rPr>
+          <w:rStyle w:val="NormalTok"/>
+        </w:rPr>
+        <w:t xml:space="preserve"> 'C:\Users\whale\uiao-core'</w:t>
+      </w:r>
+      <w:r>
+        <w:br/>
+      </w:r>
+      <w:r>
+        <w:rPr>
+          <w:rStyle w:val="NormalTok"/>
+        </w:rPr>
+        <w:t xml:space="preserve">git add schemas/adapter-registry/ canon/adapter-registry.</w:t>
+      </w:r>
+      <w:r>
+        <w:rPr>
+          <w:rStyle w:val="FunctionTok"/>
+        </w:rPr>
+        <w:t xml:space="preserve">yaml</w:t>
+      </w:r>
+      <w:r>
+        <w:rPr>
+          <w:rStyle w:val="NormalTok"/>
+        </w:rPr>
+        <w:t xml:space="preserve"> canon/modernization-registry.</w:t>
+      </w:r>
+      <w:r>
+        <w:rPr>
+          <w:rStyle w:val="FunctionTok"/>
+        </w:rPr>
+        <w:t xml:space="preserve">yaml</w:t>
+      </w:r>
+      <w:r>
+        <w:rPr>
+          <w:rStyle w:val="NormalTok"/>
+        </w:rPr>
+        <w:t xml:space="preserve"> ARCHITECTURE.</w:t>
+      </w:r>
+      <w:r>
+        <w:rPr>
+          <w:rStyle w:val="FunctionTok"/>
+        </w:rPr>
+        <w:t xml:space="preserve">md</w:t>
+      </w:r>
+      <w:r>
+        <w:br/>
+      </w:r>
+      <w:r>
+        <w:rPr>
+          <w:rStyle w:val="NormalTok"/>
+        </w:rPr>
+        <w:t xml:space="preserve">git commit -m </w:t>
+      </w:r>
+      <w:r>
+        <w:rPr>
+          <w:rStyle w:val="StringTok"/>
+        </w:rPr>
+        <w:t xml:space="preserve">"[UIAO-CORE] CREATE: Step 0a — adapter registries (dual-axis taxonomy) + ARCHITECTURE.md v0.5.0"</w:t>
+      </w:r>
+      <w:r>
+        <w:br/>
+      </w:r>
+      <w:r>
+        <w:rPr>
+          <w:rStyle w:val="NormalTok"/>
+        </w:rPr>
+        <w:t xml:space="preserve">git push</w:t>
+      </w:r>
+      <w:r>
+        <w:br/>
+      </w:r>
+      <w:r>
+        <w:br/>
+      </w:r>
+      <w:r>
+        <w:rPr>
+          <w:rStyle w:val="CommentTok"/>
+        </w:rPr>
+        <w:t xml:space="preserve"># uiao-docs — session log append</w:t>
+      </w:r>
+      <w:r>
+        <w:br/>
+      </w:r>
+      <w:r>
+        <w:rPr>
+          <w:rStyle w:val="FunctionTok"/>
+        </w:rPr>
+        <w:t xml:space="preserve">Set-Location</w:t>
+      </w:r>
+      <w:r>
+        <w:rPr>
+          <w:rStyle w:val="NormalTok"/>
+        </w:rPr>
+        <w:t xml:space="preserve"> 'C:\Users\whale\uiao-docs'</w:t>
+      </w:r>
+      <w:r>
+        <w:br/>
+      </w:r>
+      <w:r>
+        <w:rPr>
+          <w:rStyle w:val="NormalTok"/>
+        </w:rPr>
+        <w:t xml:space="preserve">git add docs/session-logs/2026-04-14-customer-docs-platform.</w:t>
+      </w:r>
+      <w:r>
+        <w:rPr>
+          <w:rStyle w:val="FunctionTok"/>
+        </w:rPr>
+        <w:t xml:space="preserve">md</w:t>
+      </w:r>
+      <w:r>
+        <w:rPr>
+          <w:rStyle w:val="NormalTok"/>
+        </w:rPr>
+        <w:t xml:space="preserve"> docs/session-logs/2026-04-14-customer-docs-platform.</w:t>
+      </w:r>
+      <w:r>
+        <w:rPr>
+          <w:rStyle w:val="FunctionTok"/>
+        </w:rPr>
+        <w:t xml:space="preserve">docx</w:t>
+      </w:r>
+      <w:r>
+        <w:br/>
+      </w:r>
+      <w:r>
+        <w:rPr>
+          <w:rStyle w:val="NormalTok"/>
+        </w:rPr>
+        <w:t xml:space="preserve">git commit -m </w:t>
+      </w:r>
+      <w:r>
+        <w:rPr>
+          <w:rStyle w:val="StringTok"/>
+        </w:rPr>
+        <w:t xml:space="preserve">"[UIAO-DOCS] LOG: append Turn 4-5 — Step 0a adapter registries landed"</w:t>
+      </w:r>
+      <w:r>
+        <w:br/>
+      </w:r>
+      <w:r>
+        <w:rPr>
+          <w:rStyle w:val="NormalTok"/>
+        </w:rPr>
+        <w:t xml:space="preserve">git push</w:t>
+      </w:r>
+    </w:p>
+    <w:p>
+      <w:r>
+        <w:pict>
+          <v:rect style="width:0;height:1.5pt" o:hralign="center" o:hrstd="t" o:hr="t"/>
+        </w:pict>
+      </w:r>
+    </w:p>
+    <w:p>
+      <w:pPr>
+        <w:pStyle w:val="Heading2"/>
+      </w:pPr>
+      <w:bookmarkStart w:id="29" w:name="next-up"/>
+      <w:r>
+        <w:t xml:space="preserve">Next Up</w:t>
+      </w:r>
+      <w:bookmarkEnd w:id="29"/>
+    </w:p>
+    <w:p>
+      <w:pPr>
+        <w:numPr>
+          <w:ilvl w:val="0"/>
+          <w:numId w:val="1020"/>
+        </w:numPr>
+        <w:pStyle w:val="Compact"/>
+      </w:pPr>
+      <w:r>
+        <w:rPr>
+          <w:b/>
+        </w:rPr>
+        <w:t xml:space="preserve">Step 0a supporting — tooling.</w:t>
+      </w:r>
+      <w:r>
+        <w:t xml:space="preserve"> </w:t>
+      </w:r>
+      <w:r>
+        <w:t xml:space="preserve">Add a small Python validator (</w:t>
+      </w:r>
+      <w:r>
+        <w:rPr>
+          <w:rStyle w:val="VerbatimChar"/>
+        </w:rPr>
+        <w:t xml:space="preserve">tools/validate_registries.py</w:t>
+      </w:r>
+      <w:r>
+        <w:t xml:space="preserve">) and wire it into the existing CI gates (</w:t>
+      </w:r>
+      <w:r>
+        <w:rPr>
+          <w:rStyle w:val="VerbatimChar"/>
+        </w:rPr>
+        <w:t xml:space="preserve">metadata-validator</w:t>
+      </w:r>
+      <w:r>
+        <w:t xml:space="preserve"> </w:t>
+      </w:r>
+      <w:r>
+        <w:t xml:space="preserve">check). Also consider a canonical-YAML linter (enforce key ordering so diffs stay clean).</w:t>
+      </w:r>
+    </w:p>
+    <w:p>
+      <w:pPr>
+        <w:numPr>
+          <w:ilvl w:val="0"/>
+          <w:numId w:val="1020"/>
+        </w:numPr>
+        <w:pStyle w:val="Compact"/>
+      </w:pPr>
+      <w:r>
+        <w:rPr>
+          <w:b/>
+        </w:rPr>
+        <w:t xml:space="preserve">Step 0b — Cross-repo sync.</w:t>
+      </w:r>
+      <w:r>
+        <w:t xml:space="preserve"> </w:t>
+      </w:r>
+      <w:r>
+        <w:t xml:space="preserve">Build</w:t>
+      </w:r>
+      <w:r>
+        <w:t xml:space="preserve"> </w:t>
+      </w:r>
+      <w:r>
+        <w:rPr>
+          <w:rStyle w:val="VerbatimChar"/>
+        </w:rPr>
+        <w:t xml:space="preserve">uiao-core/tools/sync_canon.py</w:t>
+      </w:r>
+      <w:r>
+        <w:t xml:space="preserve"> </w:t>
+      </w:r>
+      <w:r>
+        <w:t xml:space="preserve">+</w:t>
+      </w:r>
+      <w:r>
+        <w:t xml:space="preserve"> </w:t>
+      </w:r>
+      <w:r>
+        <w:rPr>
+          <w:rStyle w:val="VerbatimChar"/>
+        </w:rPr>
+        <w:t xml:space="preserve">.github/workflows/canon-sync-dispatch.yml</w:t>
+      </w:r>
+      <w:r>
+        <w:t xml:space="preserve">, and the matching receiver</w:t>
+      </w:r>
+      <w:r>
+        <w:t xml:space="preserve"> </w:t>
+      </w:r>
+      <w:r>
+        <w:rPr>
+          <w:rStyle w:val="VerbatimChar"/>
+        </w:rPr>
+        <w:t xml:space="preserve">uiao-docs/.github/workflows/canon-sync-receive.yml</w:t>
+      </w:r>
+      <w:r>
+        <w:t xml:space="preserve">. This is what turns the registries from static files into a propagating source of truth.</w:t>
+      </w:r>
+    </w:p>
+    <w:p>
+      <w:pPr>
+        <w:numPr>
+          <w:ilvl w:val="0"/>
+          <w:numId w:val="1020"/>
+        </w:numPr>
+        <w:pStyle w:val="Compact"/>
+      </w:pPr>
+      <w:r>
+        <w:rPr>
+          <w:b/>
+        </w:rPr>
+        <w:t xml:space="preserve">ODA-15 resolution.</w:t>
+      </w:r>
+      <w:r>
+        <w:t xml:space="preserve"> </w:t>
+      </w:r>
+      <w:r>
+        <w:t xml:space="preserve">At some point Michael picks (a), (b), or (c). Until then, modernization adapters stay</w:t>
+      </w:r>
+      <w:r>
+        <w:t xml:space="preserve"> </w:t>
+      </w:r>
+      <w:r>
+        <w:rPr>
+          <w:rStyle w:val="VerbatimChar"/>
+        </w:rPr>
+        <w:t xml:space="preserve">unmapped</w:t>
+      </w:r>
+      <w:r>
+        <w:t xml:space="preserve"> </w:t>
+      </w:r>
+      <w:r>
+        <w:t xml:space="preserve">and any canon review of UIAO_003 must carry ODA-15 as a blocker for promoting §4.2–§4.5 from NEW (Proposed) to canonical.</w:t>
+      </w:r>
+    </w:p>
+    <w:p>
+      <w:pPr>
+        <w:numPr>
+          <w:ilvl w:val="0"/>
+          <w:numId w:val="1020"/>
+        </w:numPr>
+        <w:pStyle w:val="Compact"/>
+      </w:pPr>
+      <w:r>
+        <w:rPr>
+          <w:b/>
+        </w:rPr>
+        <w:t xml:space="preserve">Track 1 monitoring action item.</w:t>
+      </w:r>
+      <w:r>
+        <w:t xml:space="preserve"> </w:t>
+      </w:r>
+      <w:r>
+        <w:t xml:space="preserve">Owner still needs to subscribe to</w:t>
+      </w:r>
+      <w:r>
+        <w:t xml:space="preserve"> </w:t>
+      </w:r>
+      <w:r>
+        <w:rPr>
+          <w:rStyle w:val="VerbatimChar"/>
+        </w:rPr>
+        <w:t xml:space="preserve">cisagov/ScubaGear</w:t>
+      </w:r>
+      <w:r>
+        <w:t xml:space="preserve"> </w:t>
+      </w:r>
+      <w:r>
+        <w:t xml:space="preserve">releases on GitHub (prior session carryover).</w:t>
       </w:r>
     </w:p>
     <w:sectPr/>
@@ -2685,6 +4949,27 @@
     <w:abstractNumId w:val="991"/>
   </w:num>
   <w:num w:numId="1013">
+    <w:abstractNumId w:val="991"/>
+  </w:num>
+  <w:num w:numId="1014">
+    <w:abstractNumId w:val="991"/>
+  </w:num>
+  <w:num w:numId="1015">
+    <w:abstractNumId w:val="991"/>
+  </w:num>
+  <w:num w:numId="1016">
+    <w:abstractNumId w:val="991"/>
+  </w:num>
+  <w:num w:numId="1017">
+    <w:abstractNumId w:val="991"/>
+  </w:num>
+  <w:num w:numId="1018">
+    <w:abstractNumId w:val="991"/>
+  </w:num>
+  <w:num w:numId="1019">
+    <w:abstractNumId w:val="991"/>
+  </w:num>
+  <w:num w:numId="1020">
     <w:abstractNumId w:val="991"/>
   </w:num>
 </w:numbering>

</xml_diff>